<commit_message>
docs: simplify report opening page
</commit_message>
<xml_diff>
--- a/output/docx/drone_sim_academic_report.docx
+++ b/output/docx/drone_sim_academic_report.docx
@@ -4,23 +4,8 @@
   <w:body>
     <w:p>
       <w:pPr>
-        <w:spacing w:before="440" w:after="200"/>
-        <w:jc w:val="center"/>
-      </w:pPr>
-      <w:r>
-        <w:rPr>
-          <w:rFonts w:ascii="Times New Roman" w:hAnsi="Times New Roman" w:eastAsia="黑体"/>
-          <w:b/>
-          <w:i w:val="0"/>
-          <w:color w:val="000000"/>
-          <w:sz w:val="32"/>
-        </w:rPr>
-        <w:t>课程设计报告</w:t>
-      </w:r>
-    </w:p>
-    <w:p>
-      <w:pPr>
         <w:pStyle w:val="Title"/>
+        <w:spacing w:before="240" w:after="240"/>
       </w:pPr>
       <w:r>
         <w:rPr>
@@ -35,7 +20,7 @@
     </w:p>
     <w:p>
       <w:pPr>
-        <w:spacing w:after="360"/>
+        <w:spacing w:before="40" w:after="120"/>
         <w:ind w:firstLine="0"/>
         <w:jc w:val="center"/>
       </w:pPr>
@@ -45,241 +30,7 @@
           <w:b/>
           <w:i w:val="0"/>
           <w:color w:val="000000"/>
-          <w:sz w:val="24"/>
-        </w:rPr>
-        <w:t>Design and Implementation of a Lightweight Quadrotor Simulator Based on ROS2</w:t>
-      </w:r>
-    </w:p>
-    <w:p>
-      <w:pPr>
-        <w:spacing w:after="200"/>
-        <w:ind w:firstLine="0"/>
-        <w:jc w:val="center"/>
-      </w:pPr>
-      <w:r>
-        <w:rPr>
-          <w:rFonts w:ascii="Times New Roman" w:hAnsi="Times New Roman" w:eastAsia="宋体"/>
-          <w:b w:val="0"/>
-          <w:i w:val="0"/>
-          <w:color w:val="000000"/>
-          <w:sz w:val="21"/>
-        </w:rPr>
-        <w:t>姓名：____________    学号：____________    班级：____________</w:t>
-      </w:r>
-    </w:p>
-    <w:tbl>
-      <w:tblPr>
-        <w:tblStyle w:val="TableGrid"/>
-        <w:tblW w:type="dxa" w:w="7800"/>
-        <w:jc w:val="center"/>
-        <w:tblLayout w:type="fixed"/>
-        <w:tblLook w:firstColumn="1" w:firstRow="1" w:lastColumn="0" w:lastRow="0" w:noHBand="0" w:noVBand="1" w:val="04A0"/>
-        <w:tblInd w:w="635" w:type="dxa"/>
-      </w:tblPr>
-      <w:tblGrid>
-        <w:gridCol w:w="1800"/>
-        <w:gridCol w:w="6000"/>
-      </w:tblGrid>
-      <w:tr>
-        <w:tc>
-          <w:tcPr>
-            <w:tcW w:type="dxa" w:w="1800"/>
-            <w:vAlign w:val="center"/>
-            <w:tcMar>
-              <w:top w:w="80" w:type="dxa"/>
-              <w:start w:w="100" w:type="dxa"/>
-              <w:bottom w:w="80" w:type="dxa"/>
-              <w:end w:w="100" w:type="dxa"/>
-            </w:tcMar>
-            <w:shd w:fill="F2F2F2"/>
-          </w:tcPr>
-          <w:p>
-            <w:pPr>
-              <w:spacing w:after="0"/>
-              <w:ind w:firstLine="0"/>
-              <w:jc w:val="center"/>
-            </w:pPr>
-            <w:r>
-              <w:rPr>
-                <w:rFonts w:ascii="Times New Roman" w:hAnsi="Times New Roman" w:eastAsia="黑体"/>
-                <w:b/>
-                <w:i w:val="0"/>
-                <w:color w:val="000000"/>
-                <w:sz w:val="19"/>
-              </w:rPr>
-              <w:t>开发环境</w:t>
-            </w:r>
-          </w:p>
-        </w:tc>
-        <w:tc>
-          <w:tcPr>
-            <w:tcW w:type="dxa" w:w="6000"/>
-            <w:vAlign w:val="center"/>
-            <w:tcMar>
-              <w:top w:w="80" w:type="dxa"/>
-              <w:start w:w="100" w:type="dxa"/>
-              <w:bottom w:w="80" w:type="dxa"/>
-              <w:end w:w="100" w:type="dxa"/>
-            </w:tcMar>
-          </w:tcPr>
-          <w:p>
-            <w:pPr>
-              <w:spacing w:after="0"/>
-              <w:ind w:firstLine="0"/>
-              <w:jc w:val="left"/>
-            </w:pPr>
-            <w:r>
-              <w:rPr>
-                <w:rFonts w:ascii="Times New Roman" w:hAnsi="Times New Roman" w:eastAsia="宋体"/>
-                <w:b w:val="0"/>
-                <w:i w:val="0"/>
-                <w:color w:val="000000"/>
-                <w:sz w:val="19"/>
-              </w:rPr>
-              <w:t>Ubuntu 22.04、ROS2 Humble、C++17、Python 3</w:t>
-            </w:r>
-          </w:p>
-        </w:tc>
-      </w:tr>
-      <w:tr>
-        <w:tc>
-          <w:tcPr>
-            <w:tcW w:type="dxa" w:w="1800"/>
-            <w:vAlign w:val="center"/>
-            <w:tcMar>
-              <w:top w:w="80" w:type="dxa"/>
-              <w:start w:w="100" w:type="dxa"/>
-              <w:bottom w:w="80" w:type="dxa"/>
-              <w:end w:w="100" w:type="dxa"/>
-            </w:tcMar>
-            <w:shd w:fill="F2F2F2"/>
-          </w:tcPr>
-          <w:p>
-            <w:pPr>
-              <w:spacing w:after="0"/>
-              <w:ind w:firstLine="0"/>
-              <w:jc w:val="center"/>
-            </w:pPr>
-            <w:r>
-              <w:rPr>
-                <w:rFonts w:ascii="Times New Roman" w:hAnsi="Times New Roman" w:eastAsia="黑体"/>
-                <w:b/>
-                <w:i w:val="0"/>
-                <w:color w:val="000000"/>
-                <w:sz w:val="19"/>
-              </w:rPr>
-              <w:t>代码仓库</w:t>
-            </w:r>
-          </w:p>
-        </w:tc>
-        <w:tc>
-          <w:tcPr>
-            <w:tcW w:type="dxa" w:w="6000"/>
-            <w:vAlign w:val="center"/>
-            <w:tcMar>
-              <w:top w:w="80" w:type="dxa"/>
-              <w:start w:w="100" w:type="dxa"/>
-              <w:bottom w:w="80" w:type="dxa"/>
-              <w:end w:w="100" w:type="dxa"/>
-            </w:tcMar>
-          </w:tcPr>
-          <w:p>
-            <w:pPr>
-              <w:spacing w:after="0"/>
-              <w:ind w:firstLine="0"/>
-              <w:jc w:val="left"/>
-            </w:pPr>
-            <w:r>
-              <w:rPr>
-                <w:rFonts w:ascii="Times New Roman" w:hAnsi="Times New Roman" w:eastAsia="宋体"/>
-                <w:b w:val="0"/>
-                <w:i w:val="0"/>
-                <w:color w:val="000000"/>
-                <w:sz w:val="19"/>
-              </w:rPr>
-              <w:t>https://github.com/VMnicht/drone_sim</w:t>
-            </w:r>
-          </w:p>
-        </w:tc>
-      </w:tr>
-      <w:tr>
-        <w:tc>
-          <w:tcPr>
-            <w:tcW w:type="dxa" w:w="1800"/>
-            <w:vAlign w:val="center"/>
-            <w:tcMar>
-              <w:top w:w="80" w:type="dxa"/>
-              <w:start w:w="100" w:type="dxa"/>
-              <w:bottom w:w="80" w:type="dxa"/>
-              <w:end w:w="100" w:type="dxa"/>
-            </w:tcMar>
-            <w:shd w:fill="F2F2F2"/>
-          </w:tcPr>
-          <w:p>
-            <w:pPr>
-              <w:spacing w:after="0"/>
-              <w:ind w:firstLine="0"/>
-              <w:jc w:val="center"/>
-            </w:pPr>
-            <w:r>
-              <w:rPr>
-                <w:rFonts w:ascii="Times New Roman" w:hAnsi="Times New Roman" w:eastAsia="黑体"/>
-                <w:b/>
-                <w:i w:val="0"/>
-                <w:color w:val="000000"/>
-                <w:sz w:val="19"/>
-              </w:rPr>
-              <w:t>完成日期</w:t>
-            </w:r>
-          </w:p>
-        </w:tc>
-        <w:tc>
-          <w:tcPr>
-            <w:tcW w:type="dxa" w:w="6000"/>
-            <w:vAlign w:val="center"/>
-            <w:tcMar>
-              <w:top w:w="80" w:type="dxa"/>
-              <w:start w:w="100" w:type="dxa"/>
-              <w:bottom w:w="80" w:type="dxa"/>
-              <w:end w:w="100" w:type="dxa"/>
-            </w:tcMar>
-          </w:tcPr>
-          <w:p>
-            <w:pPr>
-              <w:spacing w:after="0"/>
-              <w:ind w:firstLine="0"/>
-              <w:jc w:val="left"/>
-            </w:pPr>
-            <w:r>
-              <w:rPr>
-                <w:rFonts w:ascii="Times New Roman" w:hAnsi="Times New Roman" w:eastAsia="宋体"/>
-                <w:b w:val="0"/>
-                <w:i w:val="0"/>
-                <w:color w:val="000000"/>
-                <w:sz w:val="19"/>
-              </w:rPr>
-              <w:t>2026 年 7 月</w:t>
-            </w:r>
-          </w:p>
-        </w:tc>
-      </w:tr>
-    </w:tbl>
-    <w:p>
-      <w:pPr>
-        <w:spacing w:after="60"/>
-      </w:pPr>
-    </w:p>
-    <w:p>
-      <w:pPr>
-        <w:pStyle w:val="Heading1"/>
-      </w:pPr>
-      <w:r>
-        <w:rPr>
-          <w:rFonts w:ascii="Times New Roman" w:hAnsi="Times New Roman" w:eastAsia="黑体"/>
-          <w:b/>
-          <w:i w:val="0"/>
-          <w:color w:val="000000"/>
-          <w:sz w:val="30"/>
+          <w:sz w:val="28"/>
         </w:rPr>
         <w:t>摘  要</w:t>
       </w:r>
@@ -302,7 +53,7 @@
     </w:p>
     <w:p>
       <w:pPr>
-        <w:spacing w:after="0"/>
+        <w:spacing w:after="160"/>
         <w:ind w:firstLine="0"/>
       </w:pPr>
       <w:r>
@@ -324,11 +75,6 @@
           <w:sz w:val="21"/>
         </w:rPr>
         <w:t>四旋翼；ROS2；六自由度动力学；几何控制；三维 A*；仿真评测</w:t>
-      </w:r>
-    </w:p>
-    <w:p>
-      <w:r>
-        <w:br w:type="page"/>
       </w:r>
     </w:p>
     <w:p>

</xml_diff>

<commit_message>
docs: remove report self-citation
</commit_message>
<xml_diff>
--- a/output/docx/drone_sim_academic_report.docx
+++ b/output/docx/drone_sim_academic_report.docx
@@ -4811,21 +4811,6 @@
     </w:p>
     <w:p>
       <w:pPr>
-        <w:pStyle w:val="ReferenceAcademic"/>
-      </w:pPr>
-      <w:r>
-        <w:rPr>
-          <w:rFonts w:ascii="Times New Roman" w:hAnsi="Times New Roman" w:eastAsia="宋体"/>
-          <w:b w:val="0"/>
-          <w:i w:val="0"/>
-          <w:color w:val="000000"/>
-          <w:sz w:val="19"/>
-        </w:rPr>
-        <w:t>[6] VMnicht. drone_sim: ROS2 小型四旋翼仿真器[EB/OL]. https://github.com/VMnicht/drone_sim, 2026.</w:t>
-      </w:r>
-    </w:p>
-    <w:p>
-      <w:pPr>
         <w:pStyle w:val="Heading1"/>
       </w:pPr>
       <w:r>

</xml_diff>